<commit_message>
Added mobile-friendly UI and improvements
</commit_message>
<xml_diff>
--- a/AI TEACHER_timetable.docx
+++ b/AI TEACHER_timetable.docx
@@ -12,7 +12,7 @@
     </w:p>
     <w:p>
       <w:r>
-        <w:t>Total Weekly Periods: 8</w:t>
+        <w:t>Total Weekly Periods: 6</w:t>
       </w:r>
     </w:p>
     <w:tbl>
@@ -395,11 +395,7 @@
             <w:tcW w:type="dxa" w:w="1530"/>
           </w:tcPr>
           <w:p>
-            <w:r>
-              <w:t>6B</w:t>
-              <w:br/>
-              <w:t>AI</w:t>
-            </w:r>
+            <w:r/>
           </w:p>
         </w:tc>
         <w:tc>
@@ -547,11 +543,7 @@
             <w:tcW w:type="dxa" w:w="1530"/>
           </w:tcPr>
           <w:p>
-            <w:r>
-              <w:t>8A</w:t>
-              <w:br/>
-              <w:t>AI</w:t>
-            </w:r>
+            <w:r/>
           </w:p>
         </w:tc>
         <w:tc>
@@ -615,11 +607,7 @@
             <w:tcW w:type="dxa" w:w="1530"/>
           </w:tcPr>
           <w:p>
-            <w:r>
-              <w:t>8A</w:t>
-              <w:br/>
-              <w:t>AI</w:t>
-            </w:r>
+            <w:r/>
           </w:p>
         </w:tc>
         <w:tc>
@@ -765,7 +753,11 @@
             <w:tcW w:type="dxa" w:w="1530"/>
           </w:tcPr>
           <w:p>
-            <w:r/>
+            <w:r>
+              <w:t>6B</w:t>
+              <w:br/>
+              <w:t>AI</w:t>
+            </w:r>
           </w:p>
         </w:tc>
         <w:tc>

</xml_diff>

<commit_message>
Added day-wise and subject-wise Excel export, improved PDF layout and download system
</commit_message>
<xml_diff>
--- a/AI TEACHER_timetable.docx
+++ b/AI TEACHER_timetable.docx
@@ -12,7 +12,7 @@
     </w:p>
     <w:p>
       <w:r>
-        <w:t>Total Weekly Periods: 6</w:t>
+        <w:t>Total Weekly Periods: 8</w:t>
       </w:r>
     </w:p>
     <w:tbl>
@@ -607,7 +607,11 @@
             <w:tcW w:type="dxa" w:w="1530"/>
           </w:tcPr>
           <w:p>
-            <w:r/>
+            <w:r>
+              <w:t>8A</w:t>
+              <w:br/>
+              <w:t>AI</w:t>
+            </w:r>
           </w:p>
         </w:tc>
         <w:tc>
@@ -765,7 +769,11 @@
             <w:tcW w:type="dxa" w:w="1530"/>
           </w:tcPr>
           <w:p>
-            <w:r/>
+            <w:r>
+              <w:t>8A</w:t>
+              <w:br/>
+              <w:t>AI</w:t>
+            </w:r>
           </w:p>
         </w:tc>
         <w:tc>

</xml_diff>